<commit_message>
frontend + abckend debugging and refactoring
</commit_message>
<xml_diff>
--- a/backend/app/tests/argus_day6_v3.docx
+++ b/backend/app/tests/argus_day6_v3.docx
@@ -4,14 +4,21 @@
   <w:body>
     <w:p>
       <w:pPr>
-        <w:pStyle w:val="Title"/>
+        <w:jc w:val="center"/>
       </w:pPr>
       <w:r>
+        <w:rPr>
+          <w:b/>
+          <w:sz w:val="32"/>
+        </w:rPr>
         <w:t>The Algorithmic Commons — Day 6 E2E Fixture</w:t>
       </w:r>
     </w:p>
     <w:p>
       <w:r>
+        <w:rPr>
+          <w:b/>
+        </w:rPr>
         <w:t>Document version: V3</w:t>
       </w:r>
     </w:p>
@@ -21,10 +28,10 @@
       </w:r>
     </w:p>
     <w:p>
-      <w:pPr>
-        <w:pStyle w:val="Heading1"/>
-      </w:pPr>
       <w:r>
+        <w:rPr>
+          <w:b/>
+        </w:rPr>
         <w:t>1. Algorithmic recommendation and polarization</w:t>
       </w:r>
     </w:p>
@@ -34,29 +41,34 @@
       </w:r>
     </w:p>
     <w:p>
-      <w:pPr>
-        <w:pStyle w:val="Heading1"/>
-      </w:pPr>
       <w:r>
+        <w:rPr>
+          <w:b/>
+        </w:rPr>
         <w:t>2. Platform engagement and outrage</w:t>
       </w:r>
     </w:p>
     <w:p>
       <w:r>
-        <w:t>Recommendation engines maximize user engagement by promoting emotionally charged political content. The available argument does not specify how engagement optimization is measured, which platforms were examined, or whether alternative explanations were controlled.</w:t>
+        <w:t>Recommendation engines maximize user engagement by promoting emotionally charged political content. There have been multiple studies that have been done on this topic including a Princeton study published in 2023</w:t>
       </w:r>
     </w:p>
     <w:p>
-      <w:pPr>
-        <w:pStyle w:val="Heading1"/>
-      </w:pPr>
       <w:r>
+        <w:rPr>
+          <w:b/>
+        </w:rPr>
         <w:t>3. Proposed conclusion</w:t>
       </w:r>
     </w:p>
     <w:p>
       <w:r>
         <w:t>The evidence therefore proves that algorithmic curation is harmful to democratic discourse. No counterexample, boundary condition, or competing causal explanation is considered.</w:t>
+      </w:r>
+    </w:p>
+    <w:p>
+      <w:r>
+        <w:t>.</w:t>
       </w:r>
     </w:p>
     <w:sectPr>
@@ -432,10 +444,6 @@
     <w:name w:val="Normal"/>
     <w:qFormat/>
     <w:rsid w:val="00FC693F"/>
-    <w:rPr>
-      <w:rFonts w:ascii="Arial" w:hAnsi="Arial"/>
-      <w:sz w:val="22"/>
-    </w:rPr>
   </w:style>
   <w:style w:type="paragraph" w:styleId="Header">
     <w:name w:val="header"/>

</xml_diff>